<commit_message>
Remove contact officer from the ministerial brief format
Drop the contact-officer line from the example brief and the contact-officer
rule from the format (Word doc + text standards), renumbering the remaining
rules. The [Name] | [Title] | [Phone] placeholder was a likely point of confusion.
</commit_message>
<xml_diff>
--- a/1. Orchestrate/Ministerial Brief Agent/Ministerial Brief Format.docx
+++ b/1. Orchestrate/Ministerial Brief Agent/Ministerial Brief Format.docx
@@ -146,19 +146,6 @@
       </w:pPr>
       <w:r>
         <w:t xml:space="preserve">ACTION — state “For Noting” or “For Decision/Approval”.</w:t>
-      </w:r>
-    </w:p>
-    <w:p>
-      <w:pPr>
-        <w:pStyle w:val="ListParagraph"/>
-        <w:numPr>
-          <w:ilvl w:val="0"/>
-          <w:numId w:val="2"/>
-        </w:numPr>
-        <w:spacing w:after="40"/>
-      </w:pPr>
-      <w:r>
-        <w:t xml:space="preserve">CONTACT OFFICER — at the end, with a name, title, phone number, and date.</w:t>
       </w:r>
     </w:p>
     <w:p>
@@ -599,7 +586,7 @@
           </w:tcPr>
           <w:p>
             <w:r>
-              <w:t xml:space="preserve">A contact officer with name, title, phone, and date appears at the end.</w:t>
+              <w:t xml:space="preserve">The action type is stated: “For Noting” or “For Decision/Approval”.</w:t>
             </w:r>
           </w:p>
         </w:tc>
@@ -649,58 +636,6 @@
           </w:tcPr>
           <w:p>
             <w:r>
-              <w:t xml:space="preserve">The action type is stated: “For Noting” or “For Decision/Approval”.</w:t>
-            </w:r>
-          </w:p>
-        </w:tc>
-      </w:tr>
-      <w:tr>
-        <w:tc>
-          <w:tcPr>
-            <w:tcW w:type="dxa" w:w="1500"/>
-            <w:tcBorders>
-              <w:top w:val="single" w:color="CCCCCC" w:sz="1"/>
-              <w:left w:val="single" w:color="CCCCCC" w:sz="1"/>
-              <w:bottom w:val="single" w:color="CCCCCC" w:sz="1"/>
-              <w:right w:val="single" w:color="CCCCCC" w:sz="1"/>
-            </w:tcBorders>
-            <w:shd w:fill="EAF1F8" w:val="clear"/>
-            <w:tcMar>
-              <w:top w:type="dxa" w:w="80"/>
-              <w:left w:type="dxa" w:w="120"/>
-              <w:bottom w:type="dxa" w:w="80"/>
-              <w:right w:type="dxa" w:w="120"/>
-            </w:tcMar>
-          </w:tcPr>
-          <w:p>
-            <w:r>
-              <w:rPr>
-                <w:b/>
-                <w:bCs/>
-              </w:rPr>
-              <w:t xml:space="preserve">9</w:t>
-            </w:r>
-          </w:p>
-        </w:tc>
-        <w:tc>
-          <w:tcPr>
-            <w:tcW w:type="dxa" w:w="7860"/>
-            <w:tcBorders>
-              <w:top w:val="single" w:color="CCCCCC" w:sz="1"/>
-              <w:left w:val="single" w:color="CCCCCC" w:sz="1"/>
-              <w:bottom w:val="single" w:color="CCCCCC" w:sz="1"/>
-              <w:right w:val="single" w:color="CCCCCC" w:sz="1"/>
-            </w:tcBorders>
-            <w:shd w:fill="EAF1F8" w:val="clear"/>
-            <w:tcMar>
-              <w:top w:type="dxa" w:w="80"/>
-              <w:left w:type="dxa" w:w="120"/>
-              <w:bottom w:type="dxa" w:w="80"/>
-              <w:right w:type="dxa" w:w="120"/>
-            </w:tcMar>
-          </w:tcPr>
-          <w:p>
-            <w:r>
               <w:t xml:space="preserve">A SUGGESTED TALKING POINTS section offers 3–4 short, data-grounded, politically neutral points the Minister can use in the meeting.</w:t>
             </w:r>
           </w:p>
@@ -916,21 +851,6 @@
       </w:r>
       <w:r>
         <w:t xml:space="preserve">For Noting</w:t>
-      </w:r>
-    </w:p>
-    <w:p>
-      <w:pPr>
-        <w:spacing w:after="60"/>
-      </w:pPr>
-      <w:r>
-        <w:rPr>
-          <w:b/>
-          <w:bCs/>
-        </w:rPr>
-        <w:t xml:space="preserve">CONTACT OFFICER: </w:t>
-      </w:r>
-      <w:r>
-        <w:t xml:space="preserve">Jane Smith | Director, Labour Market Analysis | 02 6100 0000 | April 2026</w:t>
       </w:r>
     </w:p>
     <w:sectPr>

</xml_diff>